<commit_message>
Docs, images, and final changes
</commit_message>
<xml_diff>
--- a/DOCS.docx
+++ b/DOCS.docx
@@ -2,7 +2,7 @@
 <file path=word/document.xml><?xml version="1.0" encoding="utf-8"?>
 <w:document xmlns:w="http://schemas.openxmlformats.org/wordprocessingml/2006/main" xmlns:m="http://schemas.openxmlformats.org/officeDocument/2006/math" xmlns:r="http://schemas.openxmlformats.org/officeDocument/2006/relationships" xmlns:o="urn:schemas-microsoft-com:office:office" xmlns:v="urn:schemas-microsoft-com:vml" xmlns:w10="urn:schemas-microsoft-com:office:word" xmlns:a="http://schemas.openxmlformats.org/drawingml/2006/main" xmlns:pic="http://schemas.openxmlformats.org/drawingml/2006/picture" xmlns:wp="http://schemas.openxmlformats.org/drawingml/2006/wordprocessingDrawing">
   <w:body>
-    <w:bookmarkStart w:id="24" w:name="hospital-management-system-user-guide"/>
+    <w:bookmarkStart w:id="69" w:name="hospital-management-system-user-guide"/>
     <w:p>
       <w:pPr>
         <w:pStyle w:val="Heading1"/>
@@ -17,6 +17,29 @@
       </w:pPr>
       <w:r>
         <w:t xml:space="preserve">This guide explains the app roles, visible tabs, and main actions. The app shows different screens based on the logged-in role.</w:t>
+      </w:r>
+    </w:p>
+    <w:p>
+      <w:pPr>
+        <w:pStyle w:val="BodyText"/>
+      </w:pPr>
+      <w:r>
+        <w:t xml:space="preserve">Screenshots are stored in the</w:t>
+      </w:r>
+      <w:r>
+        <w:t xml:space="preserve"> </w:t>
+      </w:r>
+      <w:r>
+        <w:rPr>
+          <w:rStyle w:val="VerbatimChar"/>
+        </w:rPr>
+        <w:t xml:space="preserve">Images</w:t>
+      </w:r>
+      <w:r>
+        <w:t xml:space="preserve"> </w:t>
+      </w:r>
+      <w:r>
+        <w:t xml:space="preserve">folder.</w:t>
       </w:r>
     </w:p>
     <w:bookmarkStart w:id="9" w:name="role-summary"/>
@@ -1221,7 +1244,805 @@
       </w:tr>
     </w:tbl>
     <w:bookmarkEnd w:id="10"/>
-    <w:bookmarkStart w:id="11" w:name="login-and-register"/>
+    <w:bookmarkStart w:id="16" w:name="example-flows"/>
+    <w:p>
+      <w:pPr>
+        <w:pStyle w:val="Heading2"/>
+      </w:pPr>
+      <w:r>
+        <w:t xml:space="preserve">Example Flows</w:t>
+      </w:r>
+    </w:p>
+    <w:bookmarkStart w:id="11" w:name="register-a-new-account"/>
+    <w:p>
+      <w:pPr>
+        <w:pStyle w:val="Heading3"/>
+      </w:pPr>
+      <w:r>
+        <w:t xml:space="preserve">Register a New Account</w:t>
+      </w:r>
+    </w:p>
+    <w:p>
+      <w:pPr>
+        <w:pStyle w:val="Compact"/>
+        <w:numPr>
+          <w:ilvl w:val="0"/>
+          <w:numId w:val="1001"/>
+        </w:numPr>
+      </w:pPr>
+      <w:r>
+        <w:t xml:space="preserve">From the login screen, click</w:t>
+      </w:r>
+      <w:r>
+        <w:t xml:space="preserve"> </w:t>
+      </w:r>
+      <w:r>
+        <w:rPr>
+          <w:rStyle w:val="VerbatimChar"/>
+        </w:rPr>
+        <w:t xml:space="preserve">Register</w:t>
+      </w:r>
+      <w:r>
+        <w:t xml:space="preserve">.</w:t>
+      </w:r>
+    </w:p>
+    <w:p>
+      <w:pPr>
+        <w:pStyle w:val="Compact"/>
+        <w:numPr>
+          <w:ilvl w:val="0"/>
+          <w:numId w:val="1001"/>
+        </w:numPr>
+      </w:pPr>
+      <w:r>
+        <w:t xml:space="preserve">Enter</w:t>
+      </w:r>
+      <w:r>
+        <w:t xml:space="preserve"> </w:t>
+      </w:r>
+      <w:r>
+        <w:rPr>
+          <w:rStyle w:val="VerbatimChar"/>
+        </w:rPr>
+        <w:t xml:space="preserve">Username</w:t>
+      </w:r>
+      <w:r>
+        <w:t xml:space="preserve">,</w:t>
+      </w:r>
+      <w:r>
+        <w:t xml:space="preserve"> </w:t>
+      </w:r>
+      <w:r>
+        <w:rPr>
+          <w:rStyle w:val="VerbatimChar"/>
+        </w:rPr>
+        <w:t xml:space="preserve">Display name</w:t>
+      </w:r>
+      <w:r>
+        <w:t xml:space="preserve">, and</w:t>
+      </w:r>
+      <w:r>
+        <w:t xml:space="preserve"> </w:t>
+      </w:r>
+      <w:r>
+        <w:rPr>
+          <w:rStyle w:val="VerbatimChar"/>
+        </w:rPr>
+        <w:t xml:space="preserve">Password</w:t>
+      </w:r>
+      <w:r>
+        <w:t xml:space="preserve">.</w:t>
+      </w:r>
+    </w:p>
+    <w:p>
+      <w:pPr>
+        <w:pStyle w:val="Compact"/>
+        <w:numPr>
+          <w:ilvl w:val="0"/>
+          <w:numId w:val="1001"/>
+        </w:numPr>
+      </w:pPr>
+      <w:r>
+        <w:t xml:space="preserve">Choose a</w:t>
+      </w:r>
+      <w:r>
+        <w:t xml:space="preserve"> </w:t>
+      </w:r>
+      <w:r>
+        <w:rPr>
+          <w:rStyle w:val="VerbatimChar"/>
+        </w:rPr>
+        <w:t xml:space="preserve">Role</w:t>
+      </w:r>
+      <w:r>
+        <w:t xml:space="preserve">: Doctor, Nurse, Administrative Staff, or Patient.</w:t>
+      </w:r>
+    </w:p>
+    <w:p>
+      <w:pPr>
+        <w:pStyle w:val="Compact"/>
+        <w:numPr>
+          <w:ilvl w:val="0"/>
+          <w:numId w:val="1001"/>
+        </w:numPr>
+      </w:pPr>
+      <w:r>
+        <w:t xml:space="preserve">Click</w:t>
+      </w:r>
+      <w:r>
+        <w:t xml:space="preserve"> </w:t>
+      </w:r>
+      <w:r>
+        <w:rPr>
+          <w:rStyle w:val="VerbatimChar"/>
+        </w:rPr>
+        <w:t xml:space="preserve">Register</w:t>
+      </w:r>
+      <w:r>
+        <w:t xml:space="preserve">.</w:t>
+      </w:r>
+    </w:p>
+    <w:p>
+      <w:pPr>
+        <w:pStyle w:val="Compact"/>
+        <w:numPr>
+          <w:ilvl w:val="0"/>
+          <w:numId w:val="1001"/>
+        </w:numPr>
+      </w:pPr>
+      <w:r>
+        <w:t xml:space="preserve">After the success message, return to the login screen and log in with the new username and password.</w:t>
+      </w:r>
+    </w:p>
+    <w:bookmarkEnd w:id="11"/>
+    <w:bookmarkStart w:id="12" w:name="create-an-appointment"/>
+    <w:p>
+      <w:pPr>
+        <w:pStyle w:val="Heading3"/>
+      </w:pPr>
+      <w:r>
+        <w:t xml:space="preserve">Create an Appointment</w:t>
+      </w:r>
+    </w:p>
+    <w:p>
+      <w:pPr>
+        <w:pStyle w:val="Compact"/>
+        <w:numPr>
+          <w:ilvl w:val="0"/>
+          <w:numId w:val="1002"/>
+        </w:numPr>
+      </w:pPr>
+      <w:r>
+        <w:t xml:space="preserve">Log in as Administrative Staff or Nurse. A Patient account can also create an appointment for their own profile.</w:t>
+      </w:r>
+    </w:p>
+    <w:p>
+      <w:pPr>
+        <w:pStyle w:val="Compact"/>
+        <w:numPr>
+          <w:ilvl w:val="0"/>
+          <w:numId w:val="1002"/>
+        </w:numPr>
+      </w:pPr>
+      <w:r>
+        <w:t xml:space="preserve">Open the</w:t>
+      </w:r>
+      <w:r>
+        <w:t xml:space="preserve"> </w:t>
+      </w:r>
+      <w:r>
+        <w:rPr>
+          <w:rStyle w:val="VerbatimChar"/>
+        </w:rPr>
+        <w:t xml:space="preserve">Appointments</w:t>
+      </w:r>
+      <w:r>
+        <w:t xml:space="preserve"> </w:t>
+      </w:r>
+      <w:r>
+        <w:t xml:space="preserve">tab.</w:t>
+      </w:r>
+    </w:p>
+    <w:p>
+      <w:pPr>
+        <w:pStyle w:val="Compact"/>
+        <w:numPr>
+          <w:ilvl w:val="0"/>
+          <w:numId w:val="1002"/>
+        </w:numPr>
+      </w:pPr>
+      <w:r>
+        <w:t xml:space="preserve">Select the patient from the patient picker.</w:t>
+      </w:r>
+    </w:p>
+    <w:p>
+      <w:pPr>
+        <w:pStyle w:val="Compact"/>
+        <w:numPr>
+          <w:ilvl w:val="0"/>
+          <w:numId w:val="1002"/>
+        </w:numPr>
+      </w:pPr>
+      <w:r>
+        <w:t xml:space="preserve">Select the doctor from the doctor picker.</w:t>
+      </w:r>
+    </w:p>
+    <w:p>
+      <w:pPr>
+        <w:pStyle w:val="Compact"/>
+        <w:numPr>
+          <w:ilvl w:val="0"/>
+          <w:numId w:val="1002"/>
+        </w:numPr>
+      </w:pPr>
+      <w:r>
+        <w:t xml:space="preserve">Enter the visit reason, appointment date, and appointment time.</w:t>
+      </w:r>
+    </w:p>
+    <w:p>
+      <w:pPr>
+        <w:pStyle w:val="Compact"/>
+        <w:numPr>
+          <w:ilvl w:val="0"/>
+          <w:numId w:val="1002"/>
+        </w:numPr>
+      </w:pPr>
+      <w:r>
+        <w:t xml:space="preserve">Leave the status as</w:t>
+      </w:r>
+      <w:r>
+        <w:t xml:space="preserve"> </w:t>
+      </w:r>
+      <w:r>
+        <w:rPr>
+          <w:rStyle w:val="VerbatimChar"/>
+        </w:rPr>
+        <w:t xml:space="preserve">Scheduled</w:t>
+      </w:r>
+      <w:r>
+        <w:t xml:space="preserve"> </w:t>
+      </w:r>
+      <w:r>
+        <w:t xml:space="preserve">for a new visit.</w:t>
+      </w:r>
+    </w:p>
+    <w:p>
+      <w:pPr>
+        <w:pStyle w:val="Compact"/>
+        <w:numPr>
+          <w:ilvl w:val="0"/>
+          <w:numId w:val="1002"/>
+        </w:numPr>
+      </w:pPr>
+      <w:r>
+        <w:t xml:space="preserve">Click</w:t>
+      </w:r>
+      <w:r>
+        <w:t xml:space="preserve"> </w:t>
+      </w:r>
+      <w:r>
+        <w:rPr>
+          <w:rStyle w:val="VerbatimChar"/>
+        </w:rPr>
+        <w:t xml:space="preserve">Add Appointment</w:t>
+      </w:r>
+      <w:r>
+        <w:t xml:space="preserve">.</w:t>
+      </w:r>
+    </w:p>
+    <w:p>
+      <w:pPr>
+        <w:pStyle w:val="Compact"/>
+        <w:numPr>
+          <w:ilvl w:val="0"/>
+          <w:numId w:val="1002"/>
+        </w:numPr>
+      </w:pPr>
+      <w:r>
+        <w:t xml:space="preserve">Use</w:t>
+      </w:r>
+      <w:r>
+        <w:t xml:space="preserve"> </w:t>
+      </w:r>
+      <w:r>
+        <w:rPr>
+          <w:rStyle w:val="VerbatimChar"/>
+        </w:rPr>
+        <w:t xml:space="preserve">Refresh List</w:t>
+      </w:r>
+      <w:r>
+        <w:t xml:space="preserve"> </w:t>
+      </w:r>
+      <w:r>
+        <w:t xml:space="preserve">if the appointment grid does not update immediately.</w:t>
+      </w:r>
+    </w:p>
+    <w:bookmarkEnd w:id="12"/>
+    <w:bookmarkStart w:id="13" w:name="add-vitals"/>
+    <w:p>
+      <w:pPr>
+        <w:pStyle w:val="Heading3"/>
+      </w:pPr>
+      <w:r>
+        <w:t xml:space="preserve">Add Vitals</w:t>
+      </w:r>
+    </w:p>
+    <w:p>
+      <w:pPr>
+        <w:pStyle w:val="Compact"/>
+        <w:numPr>
+          <w:ilvl w:val="0"/>
+          <w:numId w:val="1003"/>
+        </w:numPr>
+      </w:pPr>
+      <w:r>
+        <w:t xml:space="preserve">Log in as Administrative Staff, Nurse, or a Doctor assigned to the patient.</w:t>
+      </w:r>
+    </w:p>
+    <w:p>
+      <w:pPr>
+        <w:pStyle w:val="Compact"/>
+        <w:numPr>
+          <w:ilvl w:val="0"/>
+          <w:numId w:val="1003"/>
+        </w:numPr>
+      </w:pPr>
+      <w:r>
+        <w:t xml:space="preserve">Open the</w:t>
+      </w:r>
+      <w:r>
+        <w:t xml:space="preserve"> </w:t>
+      </w:r>
+      <w:r>
+        <w:rPr>
+          <w:rStyle w:val="VerbatimChar"/>
+        </w:rPr>
+        <w:t xml:space="preserve">Vitals</w:t>
+      </w:r>
+      <w:r>
+        <w:t xml:space="preserve"> </w:t>
+      </w:r>
+      <w:r>
+        <w:t xml:space="preserve">tab.</w:t>
+      </w:r>
+    </w:p>
+    <w:p>
+      <w:pPr>
+        <w:pStyle w:val="Compact"/>
+        <w:numPr>
+          <w:ilvl w:val="0"/>
+          <w:numId w:val="1003"/>
+        </w:numPr>
+      </w:pPr>
+      <w:r>
+        <w:t xml:space="preserve">Select the patient.</w:t>
+      </w:r>
+    </w:p>
+    <w:p>
+      <w:pPr>
+        <w:pStyle w:val="Compact"/>
+        <w:numPr>
+          <w:ilvl w:val="0"/>
+          <w:numId w:val="1003"/>
+        </w:numPr>
+      </w:pPr>
+      <w:r>
+        <w:t xml:space="preserve">Enter heart rate, blood pressure, oxygen level, temperature, and notes.</w:t>
+      </w:r>
+    </w:p>
+    <w:p>
+      <w:pPr>
+        <w:pStyle w:val="Compact"/>
+        <w:numPr>
+          <w:ilvl w:val="0"/>
+          <w:numId w:val="1003"/>
+        </w:numPr>
+      </w:pPr>
+      <w:r>
+        <w:t xml:space="preserve">Click</w:t>
+      </w:r>
+      <w:r>
+        <w:t xml:space="preserve"> </w:t>
+      </w:r>
+      <w:r>
+        <w:rPr>
+          <w:rStyle w:val="VerbatimChar"/>
+        </w:rPr>
+        <w:t xml:space="preserve">Add Vitals</w:t>
+      </w:r>
+      <w:r>
+        <w:t xml:space="preserve">.</w:t>
+      </w:r>
+    </w:p>
+    <w:p>
+      <w:pPr>
+        <w:pStyle w:val="Compact"/>
+        <w:numPr>
+          <w:ilvl w:val="0"/>
+          <w:numId w:val="1003"/>
+        </w:numPr>
+      </w:pPr>
+      <w:r>
+        <w:t xml:space="preserve">Review the calculated status:</w:t>
+      </w:r>
+      <w:r>
+        <w:t xml:space="preserve"> </w:t>
+      </w:r>
+      <w:r>
+        <w:rPr>
+          <w:rStyle w:val="VerbatimChar"/>
+        </w:rPr>
+        <w:t xml:space="preserve">Normal</w:t>
+      </w:r>
+      <w:r>
+        <w:t xml:space="preserve">,</w:t>
+      </w:r>
+      <w:r>
+        <w:t xml:space="preserve"> </w:t>
+      </w:r>
+      <w:r>
+        <w:rPr>
+          <w:rStyle w:val="VerbatimChar"/>
+        </w:rPr>
+        <w:t xml:space="preserve">Warning</w:t>
+      </w:r>
+      <w:r>
+        <w:t xml:space="preserve">, or</w:t>
+      </w:r>
+      <w:r>
+        <w:t xml:space="preserve"> </w:t>
+      </w:r>
+      <w:r>
+        <w:rPr>
+          <w:rStyle w:val="VerbatimChar"/>
+        </w:rPr>
+        <w:t xml:space="preserve">Critical</w:t>
+      </w:r>
+      <w:r>
+        <w:t xml:space="preserve">.</w:t>
+      </w:r>
+    </w:p>
+    <w:p>
+      <w:pPr>
+        <w:pStyle w:val="Compact"/>
+        <w:numPr>
+          <w:ilvl w:val="0"/>
+          <w:numId w:val="1003"/>
+        </w:numPr>
+      </w:pPr>
+      <w:r>
+        <w:t xml:space="preserve">Check</w:t>
+      </w:r>
+      <w:r>
+        <w:t xml:space="preserve"> </w:t>
+      </w:r>
+      <w:r>
+        <w:rPr>
+          <w:rStyle w:val="VerbatimChar"/>
+        </w:rPr>
+        <w:t xml:space="preserve">Notifications</w:t>
+      </w:r>
+      <w:r>
+        <w:t xml:space="preserve"> </w:t>
+      </w:r>
+      <w:r>
+        <w:t xml:space="preserve">if the vitals create an alert.</w:t>
+      </w:r>
+    </w:p>
+    <w:bookmarkEnd w:id="13"/>
+    <w:bookmarkStart w:id="14" w:name="chat-with-a-patient-or-staff"/>
+    <w:p>
+      <w:pPr>
+        <w:pStyle w:val="Heading3"/>
+      </w:pPr>
+      <w:r>
+        <w:t xml:space="preserve">Chat With a Patient or Staff</w:t>
+      </w:r>
+    </w:p>
+    <w:p>
+      <w:pPr>
+        <w:pStyle w:val="Compact"/>
+        <w:numPr>
+          <w:ilvl w:val="0"/>
+          <w:numId w:val="1004"/>
+        </w:numPr>
+      </w:pPr>
+      <w:r>
+        <w:t xml:space="preserve">Staff users can open the</w:t>
+      </w:r>
+      <w:r>
+        <w:t xml:space="preserve"> </w:t>
+      </w:r>
+      <w:r>
+        <w:rPr>
+          <w:rStyle w:val="VerbatimChar"/>
+        </w:rPr>
+        <w:t xml:space="preserve">Messages</w:t>
+      </w:r>
+      <w:r>
+        <w:t xml:space="preserve"> </w:t>
+      </w:r>
+      <w:r>
+        <w:t xml:space="preserve">tab, click</w:t>
+      </w:r>
+      <w:r>
+        <w:t xml:space="preserve"> </w:t>
+      </w:r>
+      <w:r>
+        <w:rPr>
+          <w:rStyle w:val="VerbatimChar"/>
+        </w:rPr>
+        <w:t xml:space="preserve">Start Patient Chat</w:t>
+      </w:r>
+      <w:r>
+        <w:t xml:space="preserve">, choose a patient, type a message, and click</w:t>
+      </w:r>
+      <w:r>
+        <w:t xml:space="preserve"> </w:t>
+      </w:r>
+      <w:r>
+        <w:rPr>
+          <w:rStyle w:val="VerbatimChar"/>
+        </w:rPr>
+        <w:t xml:space="preserve">Send Message</w:t>
+      </w:r>
+      <w:r>
+        <w:t xml:space="preserve">.</w:t>
+      </w:r>
+    </w:p>
+    <w:p>
+      <w:pPr>
+        <w:pStyle w:val="Compact"/>
+        <w:numPr>
+          <w:ilvl w:val="0"/>
+          <w:numId w:val="1004"/>
+        </w:numPr>
+      </w:pPr>
+      <w:r>
+        <w:t xml:space="preserve">Doctors can also open an assigned patient chat from</w:t>
+      </w:r>
+      <w:r>
+        <w:t xml:space="preserve"> </w:t>
+      </w:r>
+      <w:r>
+        <w:rPr>
+          <w:rStyle w:val="VerbatimChar"/>
+        </w:rPr>
+        <w:t xml:space="preserve">My Visits</w:t>
+      </w:r>
+      <w:r>
+        <w:t xml:space="preserve"> </w:t>
+      </w:r>
+      <w:r>
+        <w:t xml:space="preserve">by clicking</w:t>
+      </w:r>
+      <w:r>
+        <w:t xml:space="preserve"> </w:t>
+      </w:r>
+      <w:r>
+        <w:rPr>
+          <w:rStyle w:val="VerbatimChar"/>
+        </w:rPr>
+        <w:t xml:space="preserve">Text Patient</w:t>
+      </w:r>
+      <w:r>
+        <w:t xml:space="preserve">.</w:t>
+      </w:r>
+    </w:p>
+    <w:p>
+      <w:pPr>
+        <w:pStyle w:val="Compact"/>
+        <w:numPr>
+          <w:ilvl w:val="0"/>
+          <w:numId w:val="1004"/>
+        </w:numPr>
+      </w:pPr>
+      <w:r>
+        <w:t xml:space="preserve">Patient users open</w:t>
+      </w:r>
+      <w:r>
+        <w:t xml:space="preserve"> </w:t>
+      </w:r>
+      <w:r>
+        <w:rPr>
+          <w:rStyle w:val="VerbatimChar"/>
+        </w:rPr>
+        <w:t xml:space="preserve">My Messages</w:t>
+      </w:r>
+      <w:r>
+        <w:t xml:space="preserve">, read staff messages, type a reply, and click</w:t>
+      </w:r>
+      <w:r>
+        <w:t xml:space="preserve"> </w:t>
+      </w:r>
+      <w:r>
+        <w:rPr>
+          <w:rStyle w:val="VerbatimChar"/>
+        </w:rPr>
+        <w:t xml:space="preserve">Send Message</w:t>
+      </w:r>
+      <w:r>
+        <w:t xml:space="preserve">.</w:t>
+      </w:r>
+    </w:p>
+    <w:p>
+      <w:pPr>
+        <w:pStyle w:val="Compact"/>
+        <w:numPr>
+          <w:ilvl w:val="0"/>
+          <w:numId w:val="1004"/>
+        </w:numPr>
+      </w:pPr>
+      <w:r>
+        <w:t xml:space="preserve">Staff users return to</w:t>
+      </w:r>
+      <w:r>
+        <w:t xml:space="preserve"> </w:t>
+      </w:r>
+      <w:r>
+        <w:rPr>
+          <w:rStyle w:val="VerbatimChar"/>
+        </w:rPr>
+        <w:t xml:space="preserve">Messages</w:t>
+      </w:r>
+      <w:r>
+        <w:t xml:space="preserve"> </w:t>
+      </w:r>
+      <w:r>
+        <w:t xml:space="preserve">to continue the same patient-specific conversation.</w:t>
+      </w:r>
+    </w:p>
+    <w:bookmarkEnd w:id="14"/>
+    <w:bookmarkStart w:id="15" w:name="manage-inventory"/>
+    <w:p>
+      <w:pPr>
+        <w:pStyle w:val="Heading3"/>
+      </w:pPr>
+      <w:r>
+        <w:t xml:space="preserve">Manage Inventory</w:t>
+      </w:r>
+    </w:p>
+    <w:p>
+      <w:pPr>
+        <w:pStyle w:val="Compact"/>
+        <w:numPr>
+          <w:ilvl w:val="0"/>
+          <w:numId w:val="1005"/>
+        </w:numPr>
+      </w:pPr>
+      <w:r>
+        <w:t xml:space="preserve">Log in as Administrative Staff.</w:t>
+      </w:r>
+    </w:p>
+    <w:p>
+      <w:pPr>
+        <w:pStyle w:val="Compact"/>
+        <w:numPr>
+          <w:ilvl w:val="0"/>
+          <w:numId w:val="1005"/>
+        </w:numPr>
+      </w:pPr>
+      <w:r>
+        <w:t xml:space="preserve">Open the</w:t>
+      </w:r>
+      <w:r>
+        <w:t xml:space="preserve"> </w:t>
+      </w:r>
+      <w:r>
+        <w:rPr>
+          <w:rStyle w:val="VerbatimChar"/>
+        </w:rPr>
+        <w:t xml:space="preserve">Inventory</w:t>
+      </w:r>
+      <w:r>
+        <w:t xml:space="preserve"> </w:t>
+      </w:r>
+      <w:r>
+        <w:t xml:space="preserve">tab.</w:t>
+      </w:r>
+    </w:p>
+    <w:p>
+      <w:pPr>
+        <w:pStyle w:val="Compact"/>
+        <w:numPr>
+          <w:ilvl w:val="0"/>
+          <w:numId w:val="1005"/>
+        </w:numPr>
+      </w:pPr>
+      <w:r>
+        <w:t xml:space="preserve">To add stock, fill in item name, category, quantity, reorder level, and location, then click</w:t>
+      </w:r>
+      <w:r>
+        <w:t xml:space="preserve"> </w:t>
+      </w:r>
+      <w:r>
+        <w:rPr>
+          <w:rStyle w:val="VerbatimChar"/>
+        </w:rPr>
+        <w:t xml:space="preserve">Add Item</w:t>
+      </w:r>
+      <w:r>
+        <w:t xml:space="preserve">.</w:t>
+      </w:r>
+    </w:p>
+    <w:p>
+      <w:pPr>
+        <w:pStyle w:val="Compact"/>
+        <w:numPr>
+          <w:ilvl w:val="0"/>
+          <w:numId w:val="1005"/>
+        </w:numPr>
+      </w:pPr>
+      <w:r>
+        <w:t xml:space="preserve">To update stock, select an inventory row, change the quantity, reorder level, or location, then click</w:t>
+      </w:r>
+      <w:r>
+        <w:t xml:space="preserve"> </w:t>
+      </w:r>
+      <w:r>
+        <w:rPr>
+          <w:rStyle w:val="VerbatimChar"/>
+        </w:rPr>
+        <w:t xml:space="preserve">Save Stock Changes</w:t>
+      </w:r>
+      <w:r>
+        <w:t xml:space="preserve">.</w:t>
+      </w:r>
+    </w:p>
+    <w:p>
+      <w:pPr>
+        <w:pStyle w:val="Compact"/>
+        <w:numPr>
+          <w:ilvl w:val="0"/>
+          <w:numId w:val="1005"/>
+        </w:numPr>
+      </w:pPr>
+      <w:r>
+        <w:t xml:space="preserve">To remove stock, select an item and click</w:t>
+      </w:r>
+      <w:r>
+        <w:t xml:space="preserve"> </w:t>
+      </w:r>
+      <w:r>
+        <w:rPr>
+          <w:rStyle w:val="VerbatimChar"/>
+        </w:rPr>
+        <w:t xml:space="preserve">Remove Item</w:t>
+      </w:r>
+      <w:r>
+        <w:t xml:space="preserve">.</w:t>
+      </w:r>
+    </w:p>
+    <w:p>
+      <w:pPr>
+        <w:pStyle w:val="Compact"/>
+        <w:numPr>
+          <w:ilvl w:val="0"/>
+          <w:numId w:val="1005"/>
+        </w:numPr>
+      </w:pPr>
+      <w:r>
+        <w:t xml:space="preserve">Use</w:t>
+      </w:r>
+      <w:r>
+        <w:t xml:space="preserve"> </w:t>
+      </w:r>
+      <w:r>
+        <w:rPr>
+          <w:rStyle w:val="VerbatimChar"/>
+        </w:rPr>
+        <w:t xml:space="preserve">Refresh List</w:t>
+      </w:r>
+      <w:r>
+        <w:t xml:space="preserve"> </w:t>
+      </w:r>
+      <w:r>
+        <w:t xml:space="preserve">to reload the inventory grid and low-stock list.</w:t>
+      </w:r>
+    </w:p>
+    <w:bookmarkEnd w:id="15"/>
+    <w:bookmarkEnd w:id="16"/>
+    <w:bookmarkStart w:id="23" w:name="login-and-register"/>
     <w:p>
       <w:pPr>
         <w:pStyle w:val="Heading2"/>
@@ -1389,8 +2210,126 @@
         </w:tc>
       </w:tr>
     </w:tbl>
-    <w:bookmarkEnd w:id="11"/>
-    <w:bookmarkStart w:id="12" w:name="dashboard"/>
+    <w:p>
+      <w:pPr>
+        <w:pStyle w:val="BodyText"/>
+      </w:pPr>
+      <w:r>
+        <w:drawing>
+          <wp:inline>
+            <wp:extent cx="2468880" cy="1927184"/>
+            <wp:effectExtent b="0" l="0" r="0" t="0"/>
+            <wp:docPr descr="" title="" id="18" name="Picture"/>
+            <a:graphic>
+              <a:graphicData uri="http://schemas.openxmlformats.org/drawingml/2006/picture">
+                <pic:pic>
+                  <pic:nvPicPr>
+                    <pic:cNvPr descr="Images/login.png" id="19" name="Picture"/>
+                    <pic:cNvPicPr>
+                      <a:picLocks noChangeArrowheads="1" noChangeAspect="1"/>
+                    </pic:cNvPicPr>
+                  </pic:nvPicPr>
+                  <pic:blipFill>
+                    <a:blip r:embed="rId17"/>
+                    <a:stretch>
+                      <a:fillRect/>
+                    </a:stretch>
+                  </pic:blipFill>
+                  <pic:spPr bwMode="auto">
+                    <a:xfrm>
+                      <a:off x="0" y="0"/>
+                      <a:ext cx="2468880" cy="1927184"/>
+                    </a:xfrm>
+                    <a:prstGeom prst="rect">
+                      <a:avLst/>
+                    </a:prstGeom>
+                    <a:noFill/>
+                    <a:ln w="9525">
+                      <a:noFill/>
+                      <a:headEnd/>
+                      <a:tailEnd/>
+                    </a:ln>
+                  </pic:spPr>
+                </pic:pic>
+              </a:graphicData>
+            </a:graphic>
+          </wp:inline>
+        </w:drawing>
+      </w:r>
+    </w:p>
+    <w:p>
+      <w:pPr>
+        <w:pStyle w:val="BodyText"/>
+      </w:pPr>
+      <w:r>
+        <w:rPr>
+          <w:i/>
+          <w:iCs/>
+        </w:rPr>
+        <w:t xml:space="preserve">Login screen: users enter their username and password, then sign in or open registration.</w:t>
+      </w:r>
+    </w:p>
+    <w:p>
+      <w:pPr>
+        <w:pStyle w:val="BodyText"/>
+      </w:pPr>
+      <w:r>
+        <w:drawing>
+          <wp:inline>
+            <wp:extent cx="2468880" cy="1927184"/>
+            <wp:effectExtent b="0" l="0" r="0" t="0"/>
+            <wp:docPr descr="" title="" id="21" name="Picture"/>
+            <a:graphic>
+              <a:graphicData uri="http://schemas.openxmlformats.org/drawingml/2006/picture">
+                <pic:pic>
+                  <pic:nvPicPr>
+                    <pic:cNvPr descr="Images/register.png" id="22" name="Picture"/>
+                    <pic:cNvPicPr>
+                      <a:picLocks noChangeArrowheads="1" noChangeAspect="1"/>
+                    </pic:cNvPicPr>
+                  </pic:nvPicPr>
+                  <pic:blipFill>
+                    <a:blip r:embed="rId20"/>
+                    <a:stretch>
+                      <a:fillRect/>
+                    </a:stretch>
+                  </pic:blipFill>
+                  <pic:spPr bwMode="auto">
+                    <a:xfrm>
+                      <a:off x="0" y="0"/>
+                      <a:ext cx="2468880" cy="1927184"/>
+                    </a:xfrm>
+                    <a:prstGeom prst="rect">
+                      <a:avLst/>
+                    </a:prstGeom>
+                    <a:noFill/>
+                    <a:ln w="9525">
+                      <a:noFill/>
+                      <a:headEnd/>
+                      <a:tailEnd/>
+                    </a:ln>
+                  </pic:spPr>
+                </pic:pic>
+              </a:graphicData>
+            </a:graphic>
+          </wp:inline>
+        </w:drawing>
+      </w:r>
+    </w:p>
+    <w:p>
+      <w:pPr>
+        <w:pStyle w:val="BodyText"/>
+      </w:pPr>
+      <w:r>
+        <w:rPr>
+          <w:i/>
+          <w:iCs/>
+        </w:rPr>
+        <w:t xml:space="preserve">Register screen: new users enter account details and choose a role before the account is created.</w:t>
+      </w:r>
+    </w:p>
+    <w:bookmarkEnd w:id="23"/>
+    <w:bookmarkStart w:id="27" w:name="dashboard"/>
     <w:p>
       <w:pPr>
         <w:pStyle w:val="Heading2"/>
@@ -1480,7 +2419,7 @@
               <w:pStyle w:val="Compact"/>
             </w:pPr>
             <w:r>
-              <w:t xml:space="preserve">Active patients, appointments today, open beds, low-stock count, emergency alerts, bed availability, current alerts</w:t>
+              <w:t xml:space="preserve">Active patients, appointments today, low-stock count, emergency alerts, current alerts</w:t>
             </w:r>
           </w:p>
         </w:tc>
@@ -1528,7 +2467,7 @@
               <w:pStyle w:val="Compact"/>
             </w:pPr>
             <w:r>
-              <w:t xml:space="preserve">Administrative Staff can also see low-stock inventory alerts; Nurse sees patient, appointment, bed, and vitals alerts</w:t>
+              <w:t xml:space="preserve">Administrative Staff can also see low-stock inventory alerts; Nurse sees patient, appointment, and vitals alerts</w:t>
             </w:r>
           </w:p>
         </w:tc>
@@ -1558,8 +2497,67 @@
         </w:tc>
       </w:tr>
     </w:tbl>
-    <w:bookmarkEnd w:id="12"/>
-    <w:bookmarkStart w:id="13" w:name="my-visits"/>
+    <w:p>
+      <w:pPr>
+        <w:pStyle w:val="BodyText"/>
+      </w:pPr>
+      <w:r>
+        <w:drawing>
+          <wp:inline>
+            <wp:extent cx="5334000" cy="3507182"/>
+            <wp:effectExtent b="0" l="0" r="0" t="0"/>
+            <wp:docPr descr="" title="" id="25" name="Picture"/>
+            <a:graphic>
+              <a:graphicData uri="http://schemas.openxmlformats.org/drawingml/2006/picture">
+                <pic:pic>
+                  <pic:nvPicPr>
+                    <pic:cNvPr descr="Images/dashboard.png" id="26" name="Picture"/>
+                    <pic:cNvPicPr>
+                      <a:picLocks noChangeArrowheads="1" noChangeAspect="1"/>
+                    </pic:cNvPicPr>
+                  </pic:nvPicPr>
+                  <pic:blipFill>
+                    <a:blip r:embed="rId24"/>
+                    <a:stretch>
+                      <a:fillRect/>
+                    </a:stretch>
+                  </pic:blipFill>
+                  <pic:spPr bwMode="auto">
+                    <a:xfrm>
+                      <a:off x="0" y="0"/>
+                      <a:ext cx="5334000" cy="3507182"/>
+                    </a:xfrm>
+                    <a:prstGeom prst="rect">
+                      <a:avLst/>
+                    </a:prstGeom>
+                    <a:noFill/>
+                    <a:ln w="9525">
+                      <a:noFill/>
+                      <a:headEnd/>
+                      <a:tailEnd/>
+                    </a:ln>
+                  </pic:spPr>
+                </pic:pic>
+              </a:graphicData>
+            </a:graphic>
+          </wp:inline>
+        </w:drawing>
+      </w:r>
+    </w:p>
+    <w:p>
+      <w:pPr>
+        <w:pStyle w:val="BodyText"/>
+      </w:pPr>
+      <w:r>
+        <w:rPr>
+          <w:i/>
+          <w:iCs/>
+        </w:rPr>
+        <w:t xml:space="preserve">Dashboard screen: administrative staff and nurses review active patient, appointment, inventory, and alert counts.</w:t>
+      </w:r>
+    </w:p>
+    <w:bookmarkEnd w:id="27"/>
+    <w:bookmarkStart w:id="31" w:name="my-visits"/>
     <w:p>
       <w:pPr>
         <w:pStyle w:val="Heading2"/>
@@ -1736,8 +2734,67 @@
         </w:tc>
       </w:tr>
     </w:tbl>
-    <w:bookmarkEnd w:id="13"/>
-    <w:bookmarkStart w:id="14" w:name="my-care"/>
+    <w:p>
+      <w:pPr>
+        <w:pStyle w:val="BodyText"/>
+      </w:pPr>
+      <w:r>
+        <w:drawing>
+          <wp:inline>
+            <wp:extent cx="5334000" cy="3507182"/>
+            <wp:effectExtent b="0" l="0" r="0" t="0"/>
+            <wp:docPr descr="" title="" id="29" name="Picture"/>
+            <a:graphic>
+              <a:graphicData uri="http://schemas.openxmlformats.org/drawingml/2006/picture">
+                <pic:pic>
+                  <pic:nvPicPr>
+                    <pic:cNvPr descr="Images/my-visits.png" id="30" name="Picture"/>
+                    <pic:cNvPicPr>
+                      <a:picLocks noChangeArrowheads="1" noChangeAspect="1"/>
+                    </pic:cNvPicPr>
+                  </pic:nvPicPr>
+                  <pic:blipFill>
+                    <a:blip r:embed="rId28"/>
+                    <a:stretch>
+                      <a:fillRect/>
+                    </a:stretch>
+                  </pic:blipFill>
+                  <pic:spPr bwMode="auto">
+                    <a:xfrm>
+                      <a:off x="0" y="0"/>
+                      <a:ext cx="5334000" cy="3507182"/>
+                    </a:xfrm>
+                    <a:prstGeom prst="rect">
+                      <a:avLst/>
+                    </a:prstGeom>
+                    <a:noFill/>
+                    <a:ln w="9525">
+                      <a:noFill/>
+                      <a:headEnd/>
+                      <a:tailEnd/>
+                    </a:ln>
+                  </pic:spPr>
+                </pic:pic>
+              </a:graphicData>
+            </a:graphic>
+          </wp:inline>
+        </w:drawing>
+      </w:r>
+    </w:p>
+    <w:p>
+      <w:pPr>
+        <w:pStyle w:val="BodyText"/>
+      </w:pPr>
+      <w:r>
+        <w:rPr>
+          <w:i/>
+          <w:iCs/>
+        </w:rPr>
+        <w:t xml:space="preserve">My Visits screen: doctors review assigned visits, see visit details, and open patient chats from their schedule.</w:t>
+      </w:r>
+    </w:p>
+    <w:bookmarkEnd w:id="31"/>
+    <w:bookmarkStart w:id="35" w:name="my-care"/>
     <w:p>
       <w:pPr>
         <w:pStyle w:val="Heading2"/>
@@ -1905,8 +2962,67 @@
         </w:tc>
       </w:tr>
     </w:tbl>
-    <w:bookmarkEnd w:id="14"/>
-    <w:bookmarkStart w:id="15" w:name="patients"/>
+    <w:p>
+      <w:pPr>
+        <w:pStyle w:val="BodyText"/>
+      </w:pPr>
+      <w:r>
+        <w:drawing>
+          <wp:inline>
+            <wp:extent cx="5334000" cy="3507182"/>
+            <wp:effectExtent b="0" l="0" r="0" t="0"/>
+            <wp:docPr descr="" title="" id="33" name="Picture"/>
+            <a:graphic>
+              <a:graphicData uri="http://schemas.openxmlformats.org/drawingml/2006/picture">
+                <pic:pic>
+                  <pic:nvPicPr>
+                    <pic:cNvPr descr="Images/my-care.png" id="34" name="Picture"/>
+                    <pic:cNvPicPr>
+                      <a:picLocks noChangeArrowheads="1" noChangeAspect="1"/>
+                    </pic:cNvPicPr>
+                  </pic:nvPicPr>
+                  <pic:blipFill>
+                    <a:blip r:embed="rId32"/>
+                    <a:stretch>
+                      <a:fillRect/>
+                    </a:stretch>
+                  </pic:blipFill>
+                  <pic:spPr bwMode="auto">
+                    <a:xfrm>
+                      <a:off x="0" y="0"/>
+                      <a:ext cx="5334000" cy="3507182"/>
+                    </a:xfrm>
+                    <a:prstGeom prst="rect">
+                      <a:avLst/>
+                    </a:prstGeom>
+                    <a:noFill/>
+                    <a:ln w="9525">
+                      <a:noFill/>
+                      <a:headEnd/>
+                      <a:tailEnd/>
+                    </a:ln>
+                  </pic:spPr>
+                </pic:pic>
+              </a:graphicData>
+            </a:graphic>
+          </wp:inline>
+        </w:drawing>
+      </w:r>
+    </w:p>
+    <w:p>
+      <w:pPr>
+        <w:pStyle w:val="BodyText"/>
+      </w:pPr>
+      <w:r>
+        <w:rPr>
+          <w:i/>
+          <w:iCs/>
+        </w:rPr>
+        <w:t xml:space="preserve">My Care screen: patients review their next appointment, latest vitals, care status, and notes.</w:t>
+      </w:r>
+    </w:p>
+    <w:bookmarkEnd w:id="35"/>
+    <w:bookmarkStart w:id="39" w:name="patients"/>
     <w:p>
       <w:pPr>
         <w:pStyle w:val="Heading2"/>
@@ -2020,7 +3136,7 @@
               <w:pStyle w:val="Compact"/>
             </w:pPr>
             <w:r>
-              <w:t xml:space="preserve">Search, filter, double-click a row, add patient, save changes, delete patient, clear form</w:t>
+              <w:t xml:space="preserve">Search, filter, double-click a row, review details, save allowed changes, refresh, clear form</w:t>
             </w:r>
           </w:p>
         </w:tc>
@@ -2044,7 +3160,7 @@
               <w:pStyle w:val="Compact"/>
             </w:pPr>
             <w:r>
-              <w:t xml:space="preserve">Administrative Staff and Nurse can add/update/delete; Doctor can view assigned patients only</w:t>
+              <w:t xml:space="preserve">Administrative Staff and Nurse can update accessible patient details; Doctor can view assigned patients only</w:t>
             </w:r>
           </w:p>
         </w:tc>
@@ -2083,31 +3199,7 @@
               <w:rPr>
                 <w:rStyle w:val="VerbatimChar"/>
               </w:rPr>
-              <w:t xml:space="preserve">Add Patient</w:t>
-            </w:r>
-            <w:r>
-              <w:t xml:space="preserve">,</w:t>
-            </w:r>
-            <w:r>
-              <w:t xml:space="preserve"> </w:t>
-            </w:r>
-            <w:r>
-              <w:rPr>
-                <w:rStyle w:val="VerbatimChar"/>
-              </w:rPr>
               <w:t xml:space="preserve">Save Changes</w:t>
-            </w:r>
-            <w:r>
-              <w:t xml:space="preserve">,</w:t>
-            </w:r>
-            <w:r>
-              <w:t xml:space="preserve"> </w:t>
-            </w:r>
-            <w:r>
-              <w:rPr>
-                <w:rStyle w:val="VerbatimChar"/>
-              </w:rPr>
-              <w:t xml:space="preserve">Delete Patient</w:t>
             </w:r>
             <w:r>
               <w:t xml:space="preserve">,</w:t>
@@ -2121,12 +3213,83 @@
               </w:rPr>
               <w:t xml:space="preserve">Clear Form</w:t>
             </w:r>
+            <w:r>
+              <w:t xml:space="preserve">,</w:t>
+            </w:r>
+            <w:r>
+              <w:t xml:space="preserve"> </w:t>
+            </w:r>
+            <w:r>
+              <w:rPr>
+                <w:rStyle w:val="VerbatimChar"/>
+              </w:rPr>
+              <w:t xml:space="preserve">Refresh</w:t>
+            </w:r>
           </w:p>
         </w:tc>
       </w:tr>
     </w:tbl>
-    <w:bookmarkEnd w:id="15"/>
-    <w:bookmarkStart w:id="16" w:name="appointments"/>
+    <w:p>
+      <w:pPr>
+        <w:pStyle w:val="BodyText"/>
+      </w:pPr>
+      <w:r>
+        <w:drawing>
+          <wp:inline>
+            <wp:extent cx="5334000" cy="3507182"/>
+            <wp:effectExtent b="0" l="0" r="0" t="0"/>
+            <wp:docPr descr="" title="" id="37" name="Picture"/>
+            <a:graphic>
+              <a:graphicData uri="http://schemas.openxmlformats.org/drawingml/2006/picture">
+                <pic:pic>
+                  <pic:nvPicPr>
+                    <pic:cNvPr descr="Images/patients.png" id="38" name="Picture"/>
+                    <pic:cNvPicPr>
+                      <a:picLocks noChangeArrowheads="1" noChangeAspect="1"/>
+                    </pic:cNvPicPr>
+                  </pic:nvPicPr>
+                  <pic:blipFill>
+                    <a:blip r:embed="rId36"/>
+                    <a:stretch>
+                      <a:fillRect/>
+                    </a:stretch>
+                  </pic:blipFill>
+                  <pic:spPr bwMode="auto">
+                    <a:xfrm>
+                      <a:off x="0" y="0"/>
+                      <a:ext cx="5334000" cy="3507182"/>
+                    </a:xfrm>
+                    <a:prstGeom prst="rect">
+                      <a:avLst/>
+                    </a:prstGeom>
+                    <a:noFill/>
+                    <a:ln w="9525">
+                      <a:noFill/>
+                      <a:headEnd/>
+                      <a:tailEnd/>
+                    </a:ln>
+                  </pic:spPr>
+                </pic:pic>
+              </a:graphicData>
+            </a:graphic>
+          </wp:inline>
+        </w:drawing>
+      </w:r>
+    </w:p>
+    <w:p>
+      <w:pPr>
+        <w:pStyle w:val="BodyText"/>
+      </w:pPr>
+      <w:r>
+        <w:rPr>
+          <w:i/>
+          <w:iCs/>
+        </w:rPr>
+        <w:t xml:space="preserve">Patients screen: staff search and filter patients, open records, and save allowed detail changes.</w:t>
+      </w:r>
+    </w:p>
+    <w:bookmarkEnd w:id="39"/>
+    <w:bookmarkStart w:id="43" w:name="appointments"/>
     <w:p>
       <w:pPr>
         <w:pStyle w:val="Heading2"/>
@@ -2384,8 +3547,67 @@
         </w:tc>
       </w:tr>
     </w:tbl>
-    <w:bookmarkEnd w:id="16"/>
-    <w:bookmarkStart w:id="17" w:name="inventory"/>
+    <w:p>
+      <w:pPr>
+        <w:pStyle w:val="BodyText"/>
+      </w:pPr>
+      <w:r>
+        <w:drawing>
+          <wp:inline>
+            <wp:extent cx="5334000" cy="3507182"/>
+            <wp:effectExtent b="0" l="0" r="0" t="0"/>
+            <wp:docPr descr="" title="" id="41" name="Picture"/>
+            <a:graphic>
+              <a:graphicData uri="http://schemas.openxmlformats.org/drawingml/2006/picture">
+                <pic:pic>
+                  <pic:nvPicPr>
+                    <pic:cNvPr descr="Images/appointments.png" id="42" name="Picture"/>
+                    <pic:cNvPicPr>
+                      <a:picLocks noChangeArrowheads="1" noChangeAspect="1"/>
+                    </pic:cNvPicPr>
+                  </pic:nvPicPr>
+                  <pic:blipFill>
+                    <a:blip r:embed="rId40"/>
+                    <a:stretch>
+                      <a:fillRect/>
+                    </a:stretch>
+                  </pic:blipFill>
+                  <pic:spPr bwMode="auto">
+                    <a:xfrm>
+                      <a:off x="0" y="0"/>
+                      <a:ext cx="5334000" cy="3507182"/>
+                    </a:xfrm>
+                    <a:prstGeom prst="rect">
+                      <a:avLst/>
+                    </a:prstGeom>
+                    <a:noFill/>
+                    <a:ln w="9525">
+                      <a:noFill/>
+                      <a:headEnd/>
+                      <a:tailEnd/>
+                    </a:ln>
+                  </pic:spPr>
+                </pic:pic>
+              </a:graphicData>
+            </a:graphic>
+          </wp:inline>
+        </w:drawing>
+      </w:r>
+    </w:p>
+    <w:p>
+      <w:pPr>
+        <w:pStyle w:val="BodyText"/>
+      </w:pPr>
+      <w:r>
+        <w:rPr>
+          <w:i/>
+          <w:iCs/>
+        </w:rPr>
+        <w:t xml:space="preserve">Appointments screen: users create or manage appointments according to their role and access level.</w:t>
+      </w:r>
+    </w:p>
+    <w:bookmarkEnd w:id="43"/>
+    <w:bookmarkStart w:id="47" w:name="inventory"/>
     <w:p>
       <w:pPr>
         <w:pStyle w:val="Heading2"/>
@@ -2553,8 +3775,67 @@
         </w:tc>
       </w:tr>
     </w:tbl>
-    <w:bookmarkEnd w:id="17"/>
-    <w:bookmarkStart w:id="18" w:name="reports"/>
+    <w:p>
+      <w:pPr>
+        <w:pStyle w:val="BodyText"/>
+      </w:pPr>
+      <w:r>
+        <w:drawing>
+          <wp:inline>
+            <wp:extent cx="5334000" cy="3507182"/>
+            <wp:effectExtent b="0" l="0" r="0" t="0"/>
+            <wp:docPr descr="" title="" id="45" name="Picture"/>
+            <a:graphic>
+              <a:graphicData uri="http://schemas.openxmlformats.org/drawingml/2006/picture">
+                <pic:pic>
+                  <pic:nvPicPr>
+                    <pic:cNvPr descr="Images/inventory.png" id="46" name="Picture"/>
+                    <pic:cNvPicPr>
+                      <a:picLocks noChangeArrowheads="1" noChangeAspect="1"/>
+                    </pic:cNvPicPr>
+                  </pic:nvPicPr>
+                  <pic:blipFill>
+                    <a:blip r:embed="rId44"/>
+                    <a:stretch>
+                      <a:fillRect/>
+                    </a:stretch>
+                  </pic:blipFill>
+                  <pic:spPr bwMode="auto">
+                    <a:xfrm>
+                      <a:off x="0" y="0"/>
+                      <a:ext cx="5334000" cy="3507182"/>
+                    </a:xfrm>
+                    <a:prstGeom prst="rect">
+                      <a:avLst/>
+                    </a:prstGeom>
+                    <a:noFill/>
+                    <a:ln w="9525">
+                      <a:noFill/>
+                      <a:headEnd/>
+                      <a:tailEnd/>
+                    </a:ln>
+                  </pic:spPr>
+                </pic:pic>
+              </a:graphicData>
+            </a:graphic>
+          </wp:inline>
+        </w:drawing>
+      </w:r>
+    </w:p>
+    <w:p>
+      <w:pPr>
+        <w:pStyle w:val="BodyText"/>
+      </w:pPr>
+      <w:r>
+        <w:rPr>
+          <w:i/>
+          <w:iCs/>
+        </w:rPr>
+        <w:t xml:space="preserve">Inventory screen: administrative staff track stock levels, low-stock items, and inventory updates.</w:t>
+      </w:r>
+    </w:p>
+    <w:bookmarkEnd w:id="47"/>
+    <w:bookmarkStart w:id="51" w:name="reports"/>
     <w:p>
       <w:pPr>
         <w:pStyle w:val="Heading2"/>
@@ -2754,24 +4035,71 @@
               </w:rPr>
               <w:t xml:space="preserve">Medication Usage</w:t>
             </w:r>
-            <w:r>
-              <w:t xml:space="preserve">,</w:t>
-            </w:r>
-            <w:r>
-              <w:t xml:space="preserve"> </w:t>
-            </w:r>
-            <w:r>
-              <w:rPr>
-                <w:rStyle w:val="VerbatimChar"/>
-              </w:rPr>
-              <w:t xml:space="preserve">Department Load</w:t>
-            </w:r>
           </w:p>
         </w:tc>
       </w:tr>
     </w:tbl>
-    <w:bookmarkEnd w:id="18"/>
-    <w:bookmarkStart w:id="19" w:name="messages"/>
+    <w:p>
+      <w:pPr>
+        <w:pStyle w:val="BodyText"/>
+      </w:pPr>
+      <w:r>
+        <w:drawing>
+          <wp:inline>
+            <wp:extent cx="5334000" cy="3507182"/>
+            <wp:effectExtent b="0" l="0" r="0" t="0"/>
+            <wp:docPr descr="" title="" id="49" name="Picture"/>
+            <a:graphic>
+              <a:graphicData uri="http://schemas.openxmlformats.org/drawingml/2006/picture">
+                <pic:pic>
+                  <pic:nvPicPr>
+                    <pic:cNvPr descr="Images/reports.png" id="50" name="Picture"/>
+                    <pic:cNvPicPr>
+                      <a:picLocks noChangeArrowheads="1" noChangeAspect="1"/>
+                    </pic:cNvPicPr>
+                  </pic:nvPicPr>
+                  <pic:blipFill>
+                    <a:blip r:embed="rId48"/>
+                    <a:stretch>
+                      <a:fillRect/>
+                    </a:stretch>
+                  </pic:blipFill>
+                  <pic:spPr bwMode="auto">
+                    <a:xfrm>
+                      <a:off x="0" y="0"/>
+                      <a:ext cx="5334000" cy="3507182"/>
+                    </a:xfrm>
+                    <a:prstGeom prst="rect">
+                      <a:avLst/>
+                    </a:prstGeom>
+                    <a:noFill/>
+                    <a:ln w="9525">
+                      <a:noFill/>
+                      <a:headEnd/>
+                      <a:tailEnd/>
+                    </a:ln>
+                  </pic:spPr>
+                </pic:pic>
+              </a:graphicData>
+            </a:graphic>
+          </wp:inline>
+        </w:drawing>
+      </w:r>
+    </w:p>
+    <w:p>
+      <w:pPr>
+        <w:pStyle w:val="BodyText"/>
+      </w:pPr>
+      <w:r>
+        <w:rPr>
+          <w:i/>
+          <w:iCs/>
+        </w:rPr>
+        <w:t xml:space="preserve">Reports screen: administrative staff choose a report type and date range, then review generated report results.</w:t>
+      </w:r>
+    </w:p>
+    <w:bookmarkEnd w:id="51"/>
+    <w:bookmarkStart w:id="55" w:name="messages"/>
     <w:p>
       <w:pPr>
         <w:pStyle w:val="Heading2"/>
@@ -2948,8 +4276,67 @@
         </w:tc>
       </w:tr>
     </w:tbl>
-    <w:bookmarkEnd w:id="19"/>
-    <w:bookmarkStart w:id="20" w:name="my-messages"/>
+    <w:p>
+      <w:pPr>
+        <w:pStyle w:val="BodyText"/>
+      </w:pPr>
+      <w:r>
+        <w:drawing>
+          <wp:inline>
+            <wp:extent cx="5334000" cy="3507182"/>
+            <wp:effectExtent b="0" l="0" r="0" t="0"/>
+            <wp:docPr descr="" title="" id="53" name="Picture"/>
+            <a:graphic>
+              <a:graphicData uri="http://schemas.openxmlformats.org/drawingml/2006/picture">
+                <pic:pic>
+                  <pic:nvPicPr>
+                    <pic:cNvPr descr="Images/messages.png" id="54" name="Picture"/>
+                    <pic:cNvPicPr>
+                      <a:picLocks noChangeArrowheads="1" noChangeAspect="1"/>
+                    </pic:cNvPicPr>
+                  </pic:nvPicPr>
+                  <pic:blipFill>
+                    <a:blip r:embed="rId52"/>
+                    <a:stretch>
+                      <a:fillRect/>
+                    </a:stretch>
+                  </pic:blipFill>
+                  <pic:spPr bwMode="auto">
+                    <a:xfrm>
+                      <a:off x="0" y="0"/>
+                      <a:ext cx="5334000" cy="3507182"/>
+                    </a:xfrm>
+                    <a:prstGeom prst="rect">
+                      <a:avLst/>
+                    </a:prstGeom>
+                    <a:noFill/>
+                    <a:ln w="9525">
+                      <a:noFill/>
+                      <a:headEnd/>
+                      <a:tailEnd/>
+                    </a:ln>
+                  </pic:spPr>
+                </pic:pic>
+              </a:graphicData>
+            </a:graphic>
+          </wp:inline>
+        </w:drawing>
+      </w:r>
+    </w:p>
+    <w:p>
+      <w:pPr>
+        <w:pStyle w:val="BodyText"/>
+      </w:pPr>
+      <w:r>
+        <w:rPr>
+          <w:i/>
+          <w:iCs/>
+        </w:rPr>
+        <w:t xml:space="preserve">Messages screen: staff select patient-specific conversations and exchange messages with patients.</w:t>
+      </w:r>
+    </w:p>
+    <w:bookmarkEnd w:id="55"/>
+    <w:bookmarkStart w:id="59" w:name="my-messages"/>
     <w:p>
       <w:pPr>
         <w:pStyle w:val="Heading2"/>
@@ -3117,8 +4504,67 @@
         </w:tc>
       </w:tr>
     </w:tbl>
-    <w:bookmarkEnd w:id="20"/>
-    <w:bookmarkStart w:id="21" w:name="vitals"/>
+    <w:p>
+      <w:pPr>
+        <w:pStyle w:val="BodyText"/>
+      </w:pPr>
+      <w:r>
+        <w:drawing>
+          <wp:inline>
+            <wp:extent cx="5334000" cy="3507182"/>
+            <wp:effectExtent b="0" l="0" r="0" t="0"/>
+            <wp:docPr descr="" title="" id="57" name="Picture"/>
+            <a:graphic>
+              <a:graphicData uri="http://schemas.openxmlformats.org/drawingml/2006/picture">
+                <pic:pic>
+                  <pic:nvPicPr>
+                    <pic:cNvPr descr="Images/my-messages.png" id="58" name="Picture"/>
+                    <pic:cNvPicPr>
+                      <a:picLocks noChangeArrowheads="1" noChangeAspect="1"/>
+                    </pic:cNvPicPr>
+                  </pic:nvPicPr>
+                  <pic:blipFill>
+                    <a:blip r:embed="rId56"/>
+                    <a:stretch>
+                      <a:fillRect/>
+                    </a:stretch>
+                  </pic:blipFill>
+                  <pic:spPr bwMode="auto">
+                    <a:xfrm>
+                      <a:off x="0" y="0"/>
+                      <a:ext cx="5334000" cy="3507182"/>
+                    </a:xfrm>
+                    <a:prstGeom prst="rect">
+                      <a:avLst/>
+                    </a:prstGeom>
+                    <a:noFill/>
+                    <a:ln w="9525">
+                      <a:noFill/>
+                      <a:headEnd/>
+                      <a:tailEnd/>
+                    </a:ln>
+                  </pic:spPr>
+                </pic:pic>
+              </a:graphicData>
+            </a:graphic>
+          </wp:inline>
+        </w:drawing>
+      </w:r>
+    </w:p>
+    <w:p>
+      <w:pPr>
+        <w:pStyle w:val="BodyText"/>
+      </w:pPr>
+      <w:r>
+        <w:rPr>
+          <w:i/>
+          <w:iCs/>
+        </w:rPr>
+        <w:t xml:space="preserve">My Messages screen: patients read staff messages and reply in their own patient-specific conversation.</w:t>
+      </w:r>
+    </w:p>
+    <w:bookmarkEnd w:id="59"/>
+    <w:bookmarkStart w:id="63" w:name="vitals"/>
     <w:p>
       <w:pPr>
         <w:pStyle w:val="Heading2"/>
@@ -3208,7 +4654,7 @@
               <w:pStyle w:val="Compact"/>
             </w:pPr>
             <w:r>
-              <w:t xml:space="preserve">Vitals grid, critical care alert list, vitals entry form</w:t>
+              <w:t xml:space="preserve">Vitals grid, vitals alert list, vitals entry form</w:t>
             </w:r>
           </w:p>
         </w:tc>
@@ -3361,8 +4807,67 @@
         </w:tc>
       </w:tr>
     </w:tbl>
-    <w:bookmarkEnd w:id="21"/>
-    <w:bookmarkStart w:id="22" w:name="notifications"/>
+    <w:p>
+      <w:pPr>
+        <w:pStyle w:val="BodyText"/>
+      </w:pPr>
+      <w:r>
+        <w:drawing>
+          <wp:inline>
+            <wp:extent cx="5334000" cy="3507182"/>
+            <wp:effectExtent b="0" l="0" r="0" t="0"/>
+            <wp:docPr descr="" title="" id="61" name="Picture"/>
+            <a:graphic>
+              <a:graphicData uri="http://schemas.openxmlformats.org/drawingml/2006/picture">
+                <pic:pic>
+                  <pic:nvPicPr>
+                    <pic:cNvPr descr="Images/vitals.png" id="62" name="Picture"/>
+                    <pic:cNvPicPr>
+                      <a:picLocks noChangeArrowheads="1" noChangeAspect="1"/>
+                    </pic:cNvPicPr>
+                  </pic:nvPicPr>
+                  <pic:blipFill>
+                    <a:blip r:embed="rId60"/>
+                    <a:stretch>
+                      <a:fillRect/>
+                    </a:stretch>
+                  </pic:blipFill>
+                  <pic:spPr bwMode="auto">
+                    <a:xfrm>
+                      <a:off x="0" y="0"/>
+                      <a:ext cx="5334000" cy="3507182"/>
+                    </a:xfrm>
+                    <a:prstGeom prst="rect">
+                      <a:avLst/>
+                    </a:prstGeom>
+                    <a:noFill/>
+                    <a:ln w="9525">
+                      <a:noFill/>
+                      <a:headEnd/>
+                      <a:tailEnd/>
+                    </a:ln>
+                  </pic:spPr>
+                </pic:pic>
+              </a:graphicData>
+            </a:graphic>
+          </wp:inline>
+        </w:drawing>
+      </w:r>
+    </w:p>
+    <w:p>
+      <w:pPr>
+        <w:pStyle w:val="BodyText"/>
+      </w:pPr>
+      <w:r>
+        <w:rPr>
+          <w:i/>
+          <w:iCs/>
+        </w:rPr>
+        <w:t xml:space="preserve">Vitals screen: staff enter patient vitals, review status results, and monitor warning or critical alerts.</w:t>
+      </w:r>
+    </w:p>
+    <w:bookmarkEnd w:id="63"/>
+    <w:bookmarkStart w:id="67" w:name="notifications"/>
     <w:p>
       <w:pPr>
         <w:pStyle w:val="Heading2"/>
@@ -3545,8 +5050,67 @@
         </w:tc>
       </w:tr>
     </w:tbl>
-    <w:bookmarkEnd w:id="22"/>
-    <w:bookmarkStart w:id="23" w:name="logout"/>
+    <w:p>
+      <w:pPr>
+        <w:pStyle w:val="BodyText"/>
+      </w:pPr>
+      <w:r>
+        <w:drawing>
+          <wp:inline>
+            <wp:extent cx="4389120" cy="2637850"/>
+            <wp:effectExtent b="0" l="0" r="0" t="0"/>
+            <wp:docPr descr="" title="" id="65" name="Picture"/>
+            <a:graphic>
+              <a:graphicData uri="http://schemas.openxmlformats.org/drawingml/2006/picture">
+                <pic:pic>
+                  <pic:nvPicPr>
+                    <pic:cNvPr descr="Images/notifications.png" id="66" name="Picture"/>
+                    <pic:cNvPicPr>
+                      <a:picLocks noChangeArrowheads="1" noChangeAspect="1"/>
+                    </pic:cNvPicPr>
+                  </pic:nvPicPr>
+                  <pic:blipFill>
+                    <a:blip r:embed="rId64"/>
+                    <a:stretch>
+                      <a:fillRect/>
+                    </a:stretch>
+                  </pic:blipFill>
+                  <pic:spPr bwMode="auto">
+                    <a:xfrm>
+                      <a:off x="0" y="0"/>
+                      <a:ext cx="4389120" cy="2637850"/>
+                    </a:xfrm>
+                    <a:prstGeom prst="rect">
+                      <a:avLst/>
+                    </a:prstGeom>
+                    <a:noFill/>
+                    <a:ln w="9525">
+                      <a:noFill/>
+                      <a:headEnd/>
+                      <a:tailEnd/>
+                    </a:ln>
+                  </pic:spPr>
+                </pic:pic>
+              </a:graphicData>
+            </a:graphic>
+          </wp:inline>
+        </w:drawing>
+      </w:r>
+    </w:p>
+    <w:p>
+      <w:pPr>
+        <w:pStyle w:val="BodyText"/>
+      </w:pPr>
+      <w:r>
+        <w:rPr>
+          <w:i/>
+          <w:iCs/>
+        </w:rPr>
+        <w:t xml:space="preserve">Notifications screen: users review recent updates filtered to the information their role is allowed to see.</w:t>
+      </w:r>
+    </w:p>
+    <w:bookmarkEnd w:id="67"/>
+    <w:bookmarkStart w:id="68" w:name="logout"/>
     <w:p>
       <w:pPr>
         <w:pStyle w:val="Heading2"/>
@@ -3725,14 +5289,14 @@
               <w:pStyle w:val="Compact"/>
             </w:pPr>
             <w:r>
-              <w:t xml:space="preserve">Main window closes and returns to the login screen</w:t>
+              <w:t xml:space="preserve">Returns to the login screen</w:t>
             </w:r>
           </w:p>
         </w:tc>
       </w:tr>
     </w:tbl>
-    <w:bookmarkEnd w:id="23"/>
-    <w:bookmarkEnd w:id="24"/>
+    <w:bookmarkEnd w:id="68"/>
+    <w:bookmarkEnd w:id="69"/>
     <w:sectPr>
       <w:footnotePr>
         <w:numRestart w:val="eachSect"/>
@@ -3843,8 +5407,243 @@
       </w:pPr>
     </w:lvl>
   </w:abstractNum>
+  <w:abstractNum w:abstractNumId="99411">
+    <w:nsid w:val="00A99411"/>
+    <w:multiLevelType w:val="multilevel"/>
+    <w:lvl w:ilvl="0">
+      <w:start w:val="1"/>
+      <w:numFmt w:val="decimal"/>
+      <w:lvlText w:val="%1."/>
+      <w:lvlJc w:val="left"/>
+      <w:pPr>
+        <w:ind w:left="720" w:hanging="360"/>
+      </w:pPr>
+    </w:lvl>
+    <w:lvl w:ilvl="1">
+      <w:start w:val="1"/>
+      <w:numFmt w:val="decimal"/>
+      <w:lvlText w:val="%2."/>
+      <w:lvlJc w:val="left"/>
+      <w:pPr>
+        <w:ind w:left="1440" w:hanging="360"/>
+      </w:pPr>
+    </w:lvl>
+    <w:lvl w:ilvl="2">
+      <w:start w:val="1"/>
+      <w:numFmt w:val="decimal"/>
+      <w:lvlText w:val="%3."/>
+      <w:lvlJc w:val="left"/>
+      <w:pPr>
+        <w:ind w:left="2160" w:hanging="360"/>
+      </w:pPr>
+    </w:lvl>
+    <w:lvl w:ilvl="3">
+      <w:start w:val="1"/>
+      <w:numFmt w:val="decimal"/>
+      <w:lvlText w:val="%4."/>
+      <w:lvlJc w:val="left"/>
+      <w:pPr>
+        <w:ind w:left="2880" w:hanging="360"/>
+      </w:pPr>
+    </w:lvl>
+    <w:lvl w:ilvl="4">
+      <w:start w:val="1"/>
+      <w:numFmt w:val="decimal"/>
+      <w:lvlText w:val="%5."/>
+      <w:lvlJc w:val="left"/>
+      <w:pPr>
+        <w:ind w:left="3600" w:hanging="360"/>
+      </w:pPr>
+    </w:lvl>
+    <w:lvl w:ilvl="5">
+      <w:start w:val="1"/>
+      <w:numFmt w:val="decimal"/>
+      <w:lvlText w:val="%6."/>
+      <w:lvlJc w:val="left"/>
+      <w:pPr>
+        <w:ind w:left="4320" w:hanging="360"/>
+      </w:pPr>
+    </w:lvl>
+    <w:lvl w:ilvl="6">
+      <w:start w:val="1"/>
+      <w:numFmt w:val="decimal"/>
+      <w:lvlText w:val="%7."/>
+      <w:lvlJc w:val="left"/>
+      <w:pPr>
+        <w:ind w:left="5040" w:hanging="360"/>
+      </w:pPr>
+    </w:lvl>
+    <w:lvl w:ilvl="7">
+      <w:start w:val="1"/>
+      <w:numFmt w:val="decimal"/>
+      <w:lvlText w:val="%8."/>
+      <w:lvlJc w:val="left"/>
+      <w:pPr>
+        <w:ind w:left="5760" w:hanging="360"/>
+      </w:pPr>
+    </w:lvl>
+    <w:lvl w:ilvl="8">
+      <w:start w:val="1"/>
+      <w:numFmt w:val="decimal"/>
+      <w:lvlText w:val="%9."/>
+      <w:lvlJc w:val="left"/>
+      <w:pPr>
+        <w:ind w:left="6480" w:hanging="360"/>
+      </w:pPr>
+    </w:lvl>
+  </w:abstractNum>
   <w:num w:numId="1000">
     <w:abstractNumId w:val="990"/>
+  </w:num>
+  <w:num w:numId="1001">
+    <w:abstractNumId w:val="99411"/>
+    <w:lvlOverride w:ilvl="0">
+      <w:startOverride w:val="1"/>
+    </w:lvlOverride>
+    <w:lvlOverride w:ilvl="1">
+      <w:startOverride w:val="1"/>
+    </w:lvlOverride>
+    <w:lvlOverride w:ilvl="2">
+      <w:startOverride w:val="1"/>
+    </w:lvlOverride>
+    <w:lvlOverride w:ilvl="3">
+      <w:startOverride w:val="1"/>
+    </w:lvlOverride>
+    <w:lvlOverride w:ilvl="4">
+      <w:startOverride w:val="1"/>
+    </w:lvlOverride>
+    <w:lvlOverride w:ilvl="5">
+      <w:startOverride w:val="1"/>
+    </w:lvlOverride>
+    <w:lvlOverride w:ilvl="6">
+      <w:startOverride w:val="1"/>
+    </w:lvlOverride>
+    <w:lvlOverride w:ilvl="7">
+      <w:startOverride w:val="1"/>
+    </w:lvlOverride>
+    <w:lvlOverride w:ilvl="8">
+      <w:startOverride w:val="1"/>
+    </w:lvlOverride>
+  </w:num>
+  <w:num w:numId="1002">
+    <w:abstractNumId w:val="99411"/>
+    <w:lvlOverride w:ilvl="0">
+      <w:startOverride w:val="1"/>
+    </w:lvlOverride>
+    <w:lvlOverride w:ilvl="1">
+      <w:startOverride w:val="1"/>
+    </w:lvlOverride>
+    <w:lvlOverride w:ilvl="2">
+      <w:startOverride w:val="1"/>
+    </w:lvlOverride>
+    <w:lvlOverride w:ilvl="3">
+      <w:startOverride w:val="1"/>
+    </w:lvlOverride>
+    <w:lvlOverride w:ilvl="4">
+      <w:startOverride w:val="1"/>
+    </w:lvlOverride>
+    <w:lvlOverride w:ilvl="5">
+      <w:startOverride w:val="1"/>
+    </w:lvlOverride>
+    <w:lvlOverride w:ilvl="6">
+      <w:startOverride w:val="1"/>
+    </w:lvlOverride>
+    <w:lvlOverride w:ilvl="7">
+      <w:startOverride w:val="1"/>
+    </w:lvlOverride>
+    <w:lvlOverride w:ilvl="8">
+      <w:startOverride w:val="1"/>
+    </w:lvlOverride>
+  </w:num>
+  <w:num w:numId="1003">
+    <w:abstractNumId w:val="99411"/>
+    <w:lvlOverride w:ilvl="0">
+      <w:startOverride w:val="1"/>
+    </w:lvlOverride>
+    <w:lvlOverride w:ilvl="1">
+      <w:startOverride w:val="1"/>
+    </w:lvlOverride>
+    <w:lvlOverride w:ilvl="2">
+      <w:startOverride w:val="1"/>
+    </w:lvlOverride>
+    <w:lvlOverride w:ilvl="3">
+      <w:startOverride w:val="1"/>
+    </w:lvlOverride>
+    <w:lvlOverride w:ilvl="4">
+      <w:startOverride w:val="1"/>
+    </w:lvlOverride>
+    <w:lvlOverride w:ilvl="5">
+      <w:startOverride w:val="1"/>
+    </w:lvlOverride>
+    <w:lvlOverride w:ilvl="6">
+      <w:startOverride w:val="1"/>
+    </w:lvlOverride>
+    <w:lvlOverride w:ilvl="7">
+      <w:startOverride w:val="1"/>
+    </w:lvlOverride>
+    <w:lvlOverride w:ilvl="8">
+      <w:startOverride w:val="1"/>
+    </w:lvlOverride>
+  </w:num>
+  <w:num w:numId="1004">
+    <w:abstractNumId w:val="99411"/>
+    <w:lvlOverride w:ilvl="0">
+      <w:startOverride w:val="1"/>
+    </w:lvlOverride>
+    <w:lvlOverride w:ilvl="1">
+      <w:startOverride w:val="1"/>
+    </w:lvlOverride>
+    <w:lvlOverride w:ilvl="2">
+      <w:startOverride w:val="1"/>
+    </w:lvlOverride>
+    <w:lvlOverride w:ilvl="3">
+      <w:startOverride w:val="1"/>
+    </w:lvlOverride>
+    <w:lvlOverride w:ilvl="4">
+      <w:startOverride w:val="1"/>
+    </w:lvlOverride>
+    <w:lvlOverride w:ilvl="5">
+      <w:startOverride w:val="1"/>
+    </w:lvlOverride>
+    <w:lvlOverride w:ilvl="6">
+      <w:startOverride w:val="1"/>
+    </w:lvlOverride>
+    <w:lvlOverride w:ilvl="7">
+      <w:startOverride w:val="1"/>
+    </w:lvlOverride>
+    <w:lvlOverride w:ilvl="8">
+      <w:startOverride w:val="1"/>
+    </w:lvlOverride>
+  </w:num>
+  <w:num w:numId="1005">
+    <w:abstractNumId w:val="99411"/>
+    <w:lvlOverride w:ilvl="0">
+      <w:startOverride w:val="1"/>
+    </w:lvlOverride>
+    <w:lvlOverride w:ilvl="1">
+      <w:startOverride w:val="1"/>
+    </w:lvlOverride>
+    <w:lvlOverride w:ilvl="2">
+      <w:startOverride w:val="1"/>
+    </w:lvlOverride>
+    <w:lvlOverride w:ilvl="3">
+      <w:startOverride w:val="1"/>
+    </w:lvlOverride>
+    <w:lvlOverride w:ilvl="4">
+      <w:startOverride w:val="1"/>
+    </w:lvlOverride>
+    <w:lvlOverride w:ilvl="5">
+      <w:startOverride w:val="1"/>
+    </w:lvlOverride>
+    <w:lvlOverride w:ilvl="6">
+      <w:startOverride w:val="1"/>
+    </w:lvlOverride>
+    <w:lvlOverride w:ilvl="7">
+      <w:startOverride w:val="1"/>
+    </w:lvlOverride>
+    <w:lvlOverride w:ilvl="8">
+      <w:startOverride w:val="1"/>
+    </w:lvlOverride>
   </w:num>
 </w:numbering>
 </file>

</xml_diff>